<commit_message>
docs: refine comment about models diagram
</commit_message>
<xml_diff>
--- a/README.docx
+++ b/README.docx
@@ -252,11 +252,9 @@
       <w:r>
         <w:t xml:space="preserve">, and minified to be sent to the client. The routes forward the request to their corresponding controllers, which will then send the response. This is a good </w:t>
       </w:r>
-      <w:proofErr w:type="spellStart"/>
-      <w:r>
-        <w:t>practise</w:t>
-      </w:r>
-      <w:proofErr w:type="spellEnd"/>
+      <w:r>
+        <w:t>practice</w:t>
+      </w:r>
       <w:r>
         <w:t xml:space="preserve"> shown in the </w:t>
       </w:r>
@@ -1769,11 +1767,9 @@
       <w:r>
         <w:t xml:space="preserve">he </w:t>
       </w:r>
-      <w:proofErr w:type="spellStart"/>
-      <w:r>
-        <w:t>mozilla</w:t>
-      </w:r>
-      <w:proofErr w:type="spellEnd"/>
+      <w:r>
+        <w:t>Mozilla</w:t>
+      </w:r>
       <w:r>
         <w:t xml:space="preserve"> tutorial</w:t>
       </w:r>
@@ -1827,6 +1823,20 @@
         <w:lastRenderedPageBreak/>
         <w:t xml:space="preserve">mongoose. </w:t>
       </w:r>
+      <w:r>
+        <w:t xml:space="preserve">This means that the multiplicities are represented by the numbers on the diagram. The maximum and minimum of each model that may be present in the relationship are at the corresponding end of the connection line. An asterisk (*) means that there is theoretically no maximum. Practically, as mentioned above, my implementation can reach the 16MB document limit of </w:t>
+      </w:r>
+      <w:r>
+        <w:t>MongoDB</w:t>
+      </w:r>
+      <w:r>
+        <w:t>.</w:t>
+      </w:r>
+    </w:p>
+    <w:p>
+      <w:pPr>
+        <w:pStyle w:val="BodyText"/>
+      </w:pPr>
       <w:r>
         <w:rPr>
           <w:rStyle w:val="VerbatimChar"/>
@@ -2128,6 +2138,7 @@
           <w:b/>
           <w:bCs/>
         </w:rPr>
+        <w:lastRenderedPageBreak/>
         <w:t>IDEA:</w:t>
       </w:r>
       <w:r>
@@ -2158,7 +2169,6 @@
       <w:bookmarkStart w:id="23" w:name="user"/>
       <w:bookmarkEnd w:id="22"/>
       <w:r>
-        <w:lastRenderedPageBreak/>
         <w:t>User</w:t>
       </w:r>
     </w:p>
@@ -2376,6 +2386,9 @@
       </w:r>
       <w:r>
         <w:br/>
+      </w:r>
+      <w:r>
+        <w:lastRenderedPageBreak/>
         <w:t>options include:</w:t>
       </w:r>
       <w:r>
@@ -2529,21 +2542,284 @@
         <w:pStyle w:val="BodyText"/>
       </w:pPr>
       <w:r>
+        <w:t xml:space="preserve">POST </w:t>
+      </w:r>
+      <w:r>
+        <w:rPr>
+          <w:rStyle w:val="VerbatimChar"/>
+        </w:rPr>
+        <w:t>post/new</w:t>
+      </w:r>
+      <w:r>
+        <w:t>:</w:t>
+      </w:r>
+      <w:r>
+        <w:br/>
+        <w:t>Create a new post. Responds with the newly created post object. The new post is passed in the request body in the following format:</w:t>
+      </w:r>
+    </w:p>
+    <w:p>
+      <w:pPr>
+        <w:pStyle w:val="SourceCode"/>
+      </w:pPr>
+      <w:r>
+        <w:rPr>
+          <w:rStyle w:val="VerbatimChar"/>
+        </w:rPr>
+        <w:t xml:space="preserve">  title: { type: String, required: true, min: 3, max: 256 },</w:t>
+      </w:r>
+      <w:r>
+        <w:br/>
+      </w:r>
+      <w:r>
+        <w:rPr>
+          <w:rStyle w:val="VerbatimChar"/>
+        </w:rPr>
+        <w:t xml:space="preserve">  text: { type: String, required: true, min: 3, max: 2048 },</w:t>
+      </w:r>
+      <w:r>
+        <w:br/>
+      </w:r>
+      <w:r>
+        <w:rPr>
+          <w:rStyle w:val="VerbatimChar"/>
+        </w:rPr>
+        <w:t xml:space="preserve">  topicId: [{ type: Schema.Types.ObjectId, required: true, ref: "topics" }],</w:t>
+      </w:r>
+      <w:r>
+        <w:br/>
+      </w:r>
+      <w:r>
+        <w:rPr>
+          <w:rStyle w:val="VerbatimChar"/>
+        </w:rPr>
+        <w:t xml:space="preserve">  expirationTime: { type: Number, required: true, min: 5 },</w:t>
+      </w:r>
+    </w:p>
+    <w:p>
+      <w:pPr>
+        <w:pStyle w:val="FirstParagraph"/>
+      </w:pPr>
+      <w:r>
+        <w:t>example:</w:t>
+      </w:r>
+      <w:r>
+        <w:br/>
+      </w:r>
+      <w:r>
+        <w:rPr>
+          <w:rStyle w:val="VerbatimChar"/>
+        </w:rPr>
+        <w:t>{"title":"Question",  "text":"What is the coolest animal?",  "expirationTime":"8",  "topicId": "674c7965f3a45b229d3b02d9"}</w:t>
+      </w:r>
+    </w:p>
+    <w:p>
+      <w:pPr>
+        <w:pStyle w:val="BodyText"/>
+      </w:pPr>
+      <w:r>
+        <w:t xml:space="preserve">GET </w:t>
+      </w:r>
+      <w:r>
+        <w:rPr>
+          <w:rStyle w:val="VerbatimChar"/>
+        </w:rPr>
+        <w:t>post/:id</w:t>
+      </w:r>
+      <w:r>
+        <w:t>:</w:t>
+      </w:r>
+      <w:r>
+        <w:br/>
+        <w:t>Detail view of a post.</w:t>
+      </w:r>
+    </w:p>
+    <w:p>
+      <w:pPr>
+        <w:pStyle w:val="BodyText"/>
+      </w:pPr>
+      <w:r>
+        <w:t xml:space="preserve">POST </w:t>
+      </w:r>
+      <w:r>
+        <w:rPr>
+          <w:rStyle w:val="VerbatimChar"/>
+        </w:rPr>
+        <w:t>post/:id/comment</w:t>
+      </w:r>
+      <w:r>
+        <w:t>:</w:t>
+      </w:r>
+      <w:r>
+        <w:br/>
+        <w:t>Accepts new comments for posts if they are still active. The comments are passed in the request body in the following format:</w:t>
+      </w:r>
+    </w:p>
+    <w:p>
+      <w:pPr>
+        <w:pStyle w:val="SourceCode"/>
+      </w:pPr>
+      <w:r>
+        <w:rPr>
+          <w:rStyle w:val="VerbatimChar"/>
+        </w:rPr>
+        <w:t>{ text: { type: String, required: true, min: 3, max: 1024 }}</w:t>
+      </w:r>
+    </w:p>
+    <w:p>
+      <w:pPr>
+        <w:pStyle w:val="FirstParagraph"/>
+      </w:pPr>
+      <w:r>
+        <w:t xml:space="preserve">POST </w:t>
+      </w:r>
+      <w:r>
+        <w:rPr>
+          <w:rStyle w:val="VerbatimChar"/>
+        </w:rPr>
+        <w:t>post/:id/react</w:t>
+      </w:r>
+      <w:r>
+        <w:t>:</w:t>
+      </w:r>
+      <w:r>
+        <w:br/>
+        <w:t>Accepts new reactions for posts if they are still active. Reactions are passed in the request body in the following format:</w:t>
+      </w:r>
+    </w:p>
+    <w:p>
+      <w:pPr>
+        <w:pStyle w:val="SourceCode"/>
+      </w:pPr>
+      <w:r>
+        <w:rPr>
+          <w:rStyle w:val="VerbatimChar"/>
+        </w:rPr>
+        <w:t>{ reaction: [options]}</w:t>
+      </w:r>
+    </w:p>
+    <w:p>
+      <w:pPr>
+        <w:pStyle w:val="FirstParagraph"/>
+      </w:pPr>
+      <w:r>
+        <w:t xml:space="preserve">The options are one of the two following strings: </w:t>
+      </w:r>
+      <w:r>
+        <w:rPr>
+          <w:rStyle w:val="VerbatimChar"/>
+        </w:rPr>
+        <w:t>"likes"</w:t>
+      </w:r>
+      <w:r>
+        <w:t xml:space="preserve"> or </w:t>
+      </w:r>
+      <w:r>
+        <w:rPr>
+          <w:rStyle w:val="VerbatimChar"/>
+        </w:rPr>
+        <w:t>"dislikes"</w:t>
+      </w:r>
+    </w:p>
+    <w:p>
+      <w:pPr>
+        <w:pStyle w:val="BodyText"/>
+      </w:pPr>
+      <w:r>
+        <w:t xml:space="preserve">GET </w:t>
+      </w:r>
+      <w:r>
+        <w:rPr>
+          <w:rStyle w:val="VerbatimChar"/>
+        </w:rPr>
+        <w:t>topic/</w:t>
+      </w:r>
+      <w:r>
+        <w:t>:</w:t>
+      </w:r>
+      <w:r>
+        <w:br/>
+        <w:t>List of all the topics. Still needs to be implemented. Curretnly responds with the string “Topic list endpoint”</w:t>
+      </w:r>
+    </w:p>
+    <w:p>
+      <w:pPr>
+        <w:pStyle w:val="BodyText"/>
+      </w:pPr>
+      <w:r>
+        <w:t xml:space="preserve">GET </w:t>
+      </w:r>
+      <w:r>
+        <w:rPr>
+          <w:rStyle w:val="VerbatimChar"/>
+        </w:rPr>
+        <w:t>topic/:id</w:t>
+      </w:r>
+      <w:r>
+        <w:t>:</w:t>
+      </w:r>
+      <w:r>
+        <w:br/>
+        <w:t xml:space="preserve">Detail view of a topic. Responds with a list of post that belong to the topic. Accepts the same request body options as </w:t>
+      </w:r>
+      <w:r>
+        <w:rPr>
+          <w:rStyle w:val="VerbatimChar"/>
+        </w:rPr>
+        <w:t>post/</w:t>
+      </w:r>
+      <w:r>
+        <w:t>.</w:t>
+      </w:r>
+    </w:p>
+    <w:p>
+      <w:pPr>
+        <w:pStyle w:val="BodyText"/>
+      </w:pPr>
+      <w:r>
+        <w:t xml:space="preserve">POST </w:t>
+      </w:r>
+      <w:r>
+        <w:rPr>
+          <w:rStyle w:val="VerbatimChar"/>
+        </w:rPr>
+        <w:t>user/login</w:t>
+      </w:r>
+      <w:r>
+        <w:t>:</w:t>
+      </w:r>
+      <w:r>
+        <w:br/>
+        <w:t>Login page. Responds with a json web token. This is implented in that way that it is easy to test/review. Accepts the following request body:</w:t>
+      </w:r>
+    </w:p>
+    <w:p>
+      <w:pPr>
+        <w:pStyle w:val="SourceCode"/>
+      </w:pPr>
+      <w:r>
+        <w:rPr>
+          <w:rStyle w:val="VerbatimChar"/>
+        </w:rPr>
+        <w:t>{email: { type: String, required: true, min: 3, max: 256 },</w:t>
+      </w:r>
+      <w:r>
+        <w:br/>
+      </w:r>
+      <w:r>
+        <w:rPr>
+          <w:rStyle w:val="VerbatimChar"/>
+        </w:rPr>
+        <w:t>password: { type: String, required: true, min: 3, max: 1024 },}</w:t>
+      </w:r>
+    </w:p>
+    <w:p>
+      <w:pPr>
+        <w:pStyle w:val="FirstParagraph"/>
+      </w:pPr>
+      <w:r>
         <w:lastRenderedPageBreak/>
-        <w:t xml:space="preserve">POST </w:t>
-      </w:r>
-      <w:r>
-        <w:rPr>
-          <w:rStyle w:val="VerbatimChar"/>
-        </w:rPr>
-        <w:t>post/new</w:t>
-      </w:r>
-      <w:r>
-        <w:t>:</w:t>
-      </w:r>
-      <w:r>
-        <w:br/>
-        <w:t>Create a new post. Responds with the newly created post object. The new post is passed in the request body in the following format:</w:t>
+        <w:t>example:</w:t>
       </w:r>
     </w:p>
     <w:p>
@@ -2554,34 +2830,16 @@
         <w:rPr>
           <w:rStyle w:val="VerbatimChar"/>
         </w:rPr>
-        <w:t xml:space="preserve">  title: { type: String, required: true, min: 3, max: 256 },</w:t>
-      </w:r>
-      <w:r>
-        <w:br/>
-      </w:r>
-      <w:r>
-        <w:rPr>
-          <w:rStyle w:val="VerbatimChar"/>
-        </w:rPr>
-        <w:t xml:space="preserve">  text: { type: String, required: true, min: 3, max: 2048 },</w:t>
-      </w:r>
-      <w:r>
-        <w:br/>
-      </w:r>
-      <w:r>
-        <w:rPr>
-          <w:rStyle w:val="VerbatimChar"/>
-        </w:rPr>
-        <w:t xml:space="preserve">  topicId: [{ type: Schema.Types.ObjectId, required: true, ref: "topics" }],</w:t>
-      </w:r>
-      <w:r>
-        <w:br/>
-      </w:r>
-      <w:r>
-        <w:rPr>
-          <w:rStyle w:val="VerbatimChar"/>
-        </w:rPr>
-        <w:t xml:space="preserve">  expirationTime: { type: Number, required: true, min: 5 },</w:t>
+        <w:t>{"email":"user@mail.com",</w:t>
+      </w:r>
+      <w:r>
+        <w:br/>
+      </w:r>
+      <w:r>
+        <w:rPr>
+          <w:rStyle w:val="VerbatimChar"/>
+        </w:rPr>
+        <w:t>"password":"TQVm4cBK"}</w:t>
       </w:r>
     </w:p>
     <w:p>
@@ -2589,252 +2847,6 @@
         <w:pStyle w:val="FirstParagraph"/>
       </w:pPr>
       <w:r>
-        <w:t>example:</w:t>
-      </w:r>
-      <w:r>
-        <w:br/>
-      </w:r>
-      <w:r>
-        <w:rPr>
-          <w:rStyle w:val="VerbatimChar"/>
-        </w:rPr>
-        <w:t>{"title":"Question",  "text":"What is the coolest animal?",  "expirationTime":"8",  "topicId": "674c7965f3a45b229d3b02d9"}</w:t>
-      </w:r>
-    </w:p>
-    <w:p>
-      <w:pPr>
-        <w:pStyle w:val="BodyText"/>
-      </w:pPr>
-      <w:r>
-        <w:t xml:space="preserve">GET </w:t>
-      </w:r>
-      <w:r>
-        <w:rPr>
-          <w:rStyle w:val="VerbatimChar"/>
-        </w:rPr>
-        <w:t>post/:id</w:t>
-      </w:r>
-      <w:r>
-        <w:t>:</w:t>
-      </w:r>
-      <w:r>
-        <w:br/>
-        <w:t>Detail view of a post.</w:t>
-      </w:r>
-    </w:p>
-    <w:p>
-      <w:pPr>
-        <w:pStyle w:val="BodyText"/>
-      </w:pPr>
-      <w:r>
-        <w:t xml:space="preserve">POST </w:t>
-      </w:r>
-      <w:r>
-        <w:rPr>
-          <w:rStyle w:val="VerbatimChar"/>
-        </w:rPr>
-        <w:t>post/:id/comment</w:t>
-      </w:r>
-      <w:r>
-        <w:t>:</w:t>
-      </w:r>
-      <w:r>
-        <w:br/>
-        <w:t>Accepts new comments for posts if they are still active. The comments are passed in the request body in the following format:</w:t>
-      </w:r>
-    </w:p>
-    <w:p>
-      <w:pPr>
-        <w:pStyle w:val="SourceCode"/>
-      </w:pPr>
-      <w:r>
-        <w:rPr>
-          <w:rStyle w:val="VerbatimChar"/>
-        </w:rPr>
-        <w:t>{ text: { type: String, required: true, min: 3, max: 1024 }}</w:t>
-      </w:r>
-    </w:p>
-    <w:p>
-      <w:pPr>
-        <w:pStyle w:val="FirstParagraph"/>
-      </w:pPr>
-      <w:r>
-        <w:t xml:space="preserve">POST </w:t>
-      </w:r>
-      <w:r>
-        <w:rPr>
-          <w:rStyle w:val="VerbatimChar"/>
-        </w:rPr>
-        <w:t>post/:id/react</w:t>
-      </w:r>
-      <w:r>
-        <w:t>:</w:t>
-      </w:r>
-      <w:r>
-        <w:br/>
-        <w:t>Accepts new reactions for posts if they are still active. Reactions are passed in the request body in the following format:</w:t>
-      </w:r>
-    </w:p>
-    <w:p>
-      <w:pPr>
-        <w:pStyle w:val="SourceCode"/>
-      </w:pPr>
-      <w:r>
-        <w:rPr>
-          <w:rStyle w:val="VerbatimChar"/>
-        </w:rPr>
-        <w:t>{ reaction: [options]}</w:t>
-      </w:r>
-    </w:p>
-    <w:p>
-      <w:pPr>
-        <w:pStyle w:val="FirstParagraph"/>
-      </w:pPr>
-      <w:r>
-        <w:t xml:space="preserve">The options are one of the two following strings: </w:t>
-      </w:r>
-      <w:r>
-        <w:rPr>
-          <w:rStyle w:val="VerbatimChar"/>
-        </w:rPr>
-        <w:t>"likes"</w:t>
-      </w:r>
-      <w:r>
-        <w:t xml:space="preserve"> or </w:t>
-      </w:r>
-      <w:r>
-        <w:rPr>
-          <w:rStyle w:val="VerbatimChar"/>
-        </w:rPr>
-        <w:t>"dislikes"</w:t>
-      </w:r>
-    </w:p>
-    <w:p>
-      <w:pPr>
-        <w:pStyle w:val="BodyText"/>
-      </w:pPr>
-      <w:r>
-        <w:t xml:space="preserve">GET </w:t>
-      </w:r>
-      <w:r>
-        <w:rPr>
-          <w:rStyle w:val="VerbatimChar"/>
-        </w:rPr>
-        <w:t>topic/</w:t>
-      </w:r>
-      <w:r>
-        <w:t>:</w:t>
-      </w:r>
-      <w:r>
-        <w:br/>
-        <w:t>List of all the topics. Still needs to be implemented. Curretnly responds with the string “Topic list endpoint”</w:t>
-      </w:r>
-    </w:p>
-    <w:p>
-      <w:pPr>
-        <w:pStyle w:val="BodyText"/>
-      </w:pPr>
-      <w:r>
-        <w:t xml:space="preserve">GET </w:t>
-      </w:r>
-      <w:r>
-        <w:rPr>
-          <w:rStyle w:val="VerbatimChar"/>
-        </w:rPr>
-        <w:t>topic/:id</w:t>
-      </w:r>
-      <w:r>
-        <w:t>:</w:t>
-      </w:r>
-      <w:r>
-        <w:br/>
-        <w:t xml:space="preserve">Detail view of a topic. Responds with a list of post that belong to the topic. Accepts the same request body options as </w:t>
-      </w:r>
-      <w:r>
-        <w:rPr>
-          <w:rStyle w:val="VerbatimChar"/>
-        </w:rPr>
-        <w:t>post/</w:t>
-      </w:r>
-      <w:r>
-        <w:t>.</w:t>
-      </w:r>
-    </w:p>
-    <w:p>
-      <w:pPr>
-        <w:pStyle w:val="BodyText"/>
-      </w:pPr>
-      <w:r>
-        <w:t xml:space="preserve">POST </w:t>
-      </w:r>
-      <w:r>
-        <w:rPr>
-          <w:rStyle w:val="VerbatimChar"/>
-        </w:rPr>
-        <w:t>user/login</w:t>
-      </w:r>
-      <w:r>
-        <w:t>:</w:t>
-      </w:r>
-      <w:r>
-        <w:br/>
-        <w:t>Login page. Responds with a json web token. This is implented in that way that it is easy to test/review. Accepts the following request body:</w:t>
-      </w:r>
-    </w:p>
-    <w:p>
-      <w:pPr>
-        <w:pStyle w:val="SourceCode"/>
-      </w:pPr>
-      <w:r>
-        <w:rPr>
-          <w:rStyle w:val="VerbatimChar"/>
-        </w:rPr>
-        <w:t>{email: { type: String, required: true, min: 3, max: 256 },</w:t>
-      </w:r>
-      <w:r>
-        <w:br/>
-      </w:r>
-      <w:r>
-        <w:rPr>
-          <w:rStyle w:val="VerbatimChar"/>
-        </w:rPr>
-        <w:t>password: { type: String, required: true, min: 3, max: 1024 },}</w:t>
-      </w:r>
-    </w:p>
-    <w:p>
-      <w:pPr>
-        <w:pStyle w:val="FirstParagraph"/>
-      </w:pPr>
-      <w:r>
-        <w:t>example:</w:t>
-      </w:r>
-    </w:p>
-    <w:p>
-      <w:pPr>
-        <w:pStyle w:val="SourceCode"/>
-      </w:pPr>
-      <w:r>
-        <w:rPr>
-          <w:rStyle w:val="VerbatimChar"/>
-        </w:rPr>
-        <w:t>{"email":"user@mail.com",</w:t>
-      </w:r>
-      <w:r>
-        <w:br/>
-      </w:r>
-      <w:r>
-        <w:rPr>
-          <w:rStyle w:val="VerbatimChar"/>
-        </w:rPr>
-        <w:t>"password":"TQVm4cBK"}</w:t>
-      </w:r>
-    </w:p>
-    <w:p>
-      <w:pPr>
-        <w:pStyle w:val="FirstParagraph"/>
-      </w:pPr>
-      <w:r>
-        <w:lastRenderedPageBreak/>
         <w:t xml:space="preserve">POST </w:t>
       </w:r>
       <w:r>
@@ -3022,6 +3034,7 @@
         <w:rPr>
           <w:rStyle w:val="VerbatimChar"/>
         </w:rPr>
+        <w:lastRenderedPageBreak/>
         <w:t>kubectl create secret generic database-connection \</w:t>
       </w:r>
       <w:r>
@@ -3043,7 +3056,6 @@
         <w:rPr>
           <w:rStyle w:val="VerbatimChar"/>
         </w:rPr>
-        <w:lastRenderedPageBreak/>
         <w:t>kubectl create secret generic json-web-token-secret \</w:t>
       </w:r>
       <w:r>

</xml_diff>